<commit_message>
v429.3.0: Aktenoptik und Testakten-PDFs verbessert
</commit_message>
<xml_diff>
--- a/testakten/arbeitsrecht-kuendigungsdrama-koerber-werk/04_organigramm_und_stellenbeschreibung.docx
+++ b/testakten/arbeitsrecht-kuendigungsdrama-koerber-werk/04_organigramm_und_stellenbeschreibung.docx
@@ -31,14 +31,6 @@
           <w:rFonts w:ascii="Times New Roman" w:hAnsi="Times New Roman"/>
         </w:rPr>
         <w:t>1. Konzernstruktur (vereinfacht)</w:t>
-      </w:r>
-    </w:p>
-    <w:p>
-      <w:pPr>
-        <w:jc w:val="left"/>
-      </w:pPr>
-      <w:r>
-        <w:t>```</w:t>
       </w:r>
     </w:p>
     <w:p>
@@ -198,14 +190,6 @@
         <w:jc w:val="left"/>
       </w:pPr>
       <w:r>
-        <w:t>```</w:t>
-      </w:r>
-    </w:p>
-    <w:p>
-      <w:pPr>
-        <w:jc w:val="left"/>
-      </w:pPr>
-      <w:r>
         <w:rPr>
           <w:b/>
         </w:rPr>
@@ -278,14 +262,6 @@
           <w:rFonts w:ascii="Times New Roman" w:hAnsi="Times New Roman"/>
         </w:rPr>
         <w:t>2. Organigramm Werk Eberswalde (vereinfacht)</w:t>
-      </w:r>
-    </w:p>
-    <w:p>
-      <w:pPr>
-        <w:jc w:val="left"/>
-      </w:pPr>
-      <w:r>
-        <w:t>```</w:t>
       </w:r>
     </w:p>
     <w:p>
@@ -422,14 +398,6 @@
       </w:pPr>
       <w:r>
         <w:t>(fachliche Anbindung an HR-Leiter Branitz)</w:t>
-      </w:r>
-    </w:p>
-    <w:p>
-      <w:pPr>
-        <w:jc w:val="left"/>
-      </w:pPr>
-      <w:r>
-        <w:t>```</w:t>
       </w:r>
     </w:p>
     <w:p/>

</xml_diff>